<commit_message>
se corrigio word marcadores y medidas de vehiculos
</commit_message>
<xml_diff>
--- a/plantillas/word_informe_combinado_vehiculo.docx
+++ b/plantillas/word_informe_combinado_vehiculo.docx
@@ -553,7 +553,7 @@
         <w:t>1</w:t>
       </w:r>
       <w:r>
-        <w:t>_veh_medidas}</w:t>
+        <w:t>_veh_largo}</w:t>
       </w:r>
       <w:r>
         <w:rPr>
@@ -624,7 +624,7 @@
         <w:t>1</w:t>
       </w:r>
       <w:r>
-        <w:t>_veh_medidas}</w:t>
+        <w:t>_veh_ancho}</w:t>
       </w:r>
       <w:r>
         <w:rPr>
@@ -695,7 +695,7 @@
         <w:t>1</w:t>
       </w:r>
       <w:r>
-        <w:t>_veh_medidas}</w:t>
+        <w:t>_veh_alto}</w:t>
       </w:r>
       <w:r>
         <w:rPr>
@@ -2850,7 +2850,7 @@
         <w:t>v</w:t>
       </w:r>
       <w:r>
-        <w:t>2_veh_medidas}</w:t>
+        <w:t>2_veh_largo}</w:t>
       </w:r>
       <w:r>
         <w:rPr>
@@ -2918,7 +2918,7 @@
         <w:t>v</w:t>
       </w:r>
       <w:r>
-        <w:t>2_veh_medidas}</w:t>
+        <w:t>2_veh_ancho}</w:t>
       </w:r>
       <w:r>
         <w:rPr>
@@ -2986,7 +2986,7 @@
         <w:t>v</w:t>
       </w:r>
       <w:r>
-        <w:t>2_veh_medidas}</w:t>
+        <w:t>2_veh_alto}</w:t>
       </w:r>
       <w:r>
         <w:rPr>
@@ -7423,25 +7423,25 @@
           <w:szCs w:val="24"/>
           <w:lang w:val="es-ES_tradnl"/>
         </w:rPr>
-        <w:t>18JUL</w:t>
-      </w:r>
-      <w:r>
-        <w:rPr>
-          <w:color w:val="FF0000"/>
-          <w:sz w:val="24"/>
-          <w:szCs w:val="24"/>
-          <w:lang w:val="es-ES_tradnl"/>
-        </w:rPr>
-        <w:t>202</w:t>
-      </w:r>
-      <w:r>
-        <w:rPr>
-          <w:color w:val="FF0000"/>
-          <w:sz w:val="24"/>
-          <w:szCs w:val="24"/>
-          <w:lang w:val="es-ES_tradnl"/>
-        </w:rPr>
-        <w:t>3</w:t>
+        <w:t>${</w:t>
+      </w:r>
+      <w:r>
+        <w:rPr>
+          <w:color w:val="FF0000"/>
+          <w:sz w:val="24"/>
+          <w:szCs w:val="24"/>
+          <w:lang w:val="es-ES_tradnl"/>
+        </w:rPr>
+        <w:t>v1</w:t>
+      </w:r>
+      <w:r>
+        <w:rPr>
+          <w:color w:val="FF0000"/>
+          <w:sz w:val="24"/>
+          <w:szCs w:val="24"/>
+          <w:lang w:val="es-ES_tradnl"/>
+        </w:rPr>
+        <w:t>_prop_man_fecha}</w:t>
       </w:r>
       <w:r>
         <w:rPr>
@@ -7459,7 +7459,25 @@
           <w:szCs w:val="24"/>
           <w:lang w:val="es-ES_tradnl"/>
         </w:rPr>
-        <w:t>22:00</w:t>
+        <w:t>${</w:t>
+      </w:r>
+      <w:r>
+        <w:rPr>
+          <w:color w:val="FF0000"/>
+          <w:sz w:val="24"/>
+          <w:szCs w:val="24"/>
+          <w:lang w:val="es-ES_tradnl"/>
+        </w:rPr>
+        <w:t>v1</w:t>
+      </w:r>
+      <w:r>
+        <w:rPr>
+          <w:color w:val="FF0000"/>
+          <w:sz w:val="24"/>
+          <w:szCs w:val="24"/>
+          <w:lang w:val="es-ES_tradnl"/>
+        </w:rPr>
+        <w:t>_prop_man_hora_inicio}</w:t>
       </w:r>
       <w:r>
         <w:rPr>

</xml_diff>